<commit_message>
docs : fix manual
</commit_message>
<xml_diff>
--- a/docs/NMEA_Sender_User_Manual.docx
+++ b/docs/NMEA_Sender_User_Manual.docx
@@ -19,9 +19,6 @@
     <w:p>
       <w:pPr>
         <w:spacing w:after="120"/>
-        <w:rPr>
-          <w:rFonts w:hint="eastAsia"/>
-        </w:rPr>
         <w:sectPr>
           <w:headerReference w:type="even" r:id="rId6"/>
           <w:headerReference w:type="default" r:id="rId7"/>
@@ -152,7 +149,6 @@
                   <w:pPr>
                     <w:spacing w:after="320"/>
                     <w:rPr>
-                      <w:rFonts w:hint="eastAsia"/>
                       <w:b/>
                       <w:color w:val="FFFFFF" w:themeColor="background1"/>
                     </w:rPr>
@@ -217,7 +213,15 @@
         <w:spacing w:after="80"/>
       </w:pPr>
       <w:r>
-        <w:t>• Settings 화면에서 COM BaudRate, UDP Broadcast/Multicast, Sentence별 UDP Endpoint를 설정합니다.</w:t>
+        <w:t xml:space="preserve">• Settings 화면에서 COM </w:t>
+      </w:r>
+      <w:proofErr w:type="spellStart"/>
+      <w:r>
+        <w:t>BaudRate</w:t>
+      </w:r>
+      <w:proofErr w:type="spellEnd"/>
+      <w:r>
+        <w:t>, UDP Broadcast/Multicast, Sentence별 UDP Endpoint를 설정합니다.</w:t>
       </w:r>
     </w:p>
     <w:p>
@@ -318,13 +322,13 @@
         <w:tblLook w:val="04A0" w:firstRow="1" w:lastRow="0" w:firstColumn="1" w:lastColumn="0" w:noHBand="0" w:noVBand="1"/>
       </w:tblPr>
       <w:tblGrid>
-        <w:gridCol w:w="1400"/>
-        <w:gridCol w:w="9146"/>
+        <w:gridCol w:w="1985"/>
+        <w:gridCol w:w="8561"/>
       </w:tblGrid>
       <w:tr>
         <w:tc>
           <w:tcPr>
-            <w:tcW w:w="0" w:type="auto"/>
+            <w:tcW w:w="1985" w:type="dxa"/>
             <w:shd w:val="clear" w:color="auto" w:fill="EAF1FF"/>
           </w:tcPr>
           <w:p>
@@ -341,7 +345,7 @@
         </w:tc>
         <w:tc>
           <w:tcPr>
-            <w:tcW w:w="0" w:type="auto"/>
+            <w:tcW w:w="8561" w:type="dxa"/>
             <w:shd w:val="clear" w:color="auto" w:fill="EAF1FF"/>
           </w:tcPr>
           <w:p>
@@ -360,7 +364,7 @@
       <w:tr>
         <w:tc>
           <w:tcPr>
-            <w:tcW w:w="0" w:type="auto"/>
+            <w:tcW w:w="1985" w:type="dxa"/>
           </w:tcPr>
           <w:p>
             <w:pPr>
@@ -373,7 +377,7 @@
         </w:tc>
         <w:tc>
           <w:tcPr>
-            <w:tcW w:w="0" w:type="auto"/>
+            <w:tcW w:w="8561" w:type="dxa"/>
           </w:tcPr>
           <w:p>
             <w:pPr>
@@ -388,7 +392,7 @@
       <w:tr>
         <w:tc>
           <w:tcPr>
-            <w:tcW w:w="0" w:type="auto"/>
+            <w:tcW w:w="1985" w:type="dxa"/>
           </w:tcPr>
           <w:p>
             <w:pPr>
@@ -401,7 +405,7 @@
         </w:tc>
         <w:tc>
           <w:tcPr>
-            <w:tcW w:w="0" w:type="auto"/>
+            <w:tcW w:w="8561" w:type="dxa"/>
           </w:tcPr>
           <w:p>
             <w:pPr>
@@ -416,7 +420,7 @@
       <w:tr>
         <w:tc>
           <w:tcPr>
-            <w:tcW w:w="0" w:type="auto"/>
+            <w:tcW w:w="1985" w:type="dxa"/>
           </w:tcPr>
           <w:p>
             <w:pPr>
@@ -429,22 +433,58 @@
         </w:tc>
         <w:tc>
           <w:tcPr>
-            <w:tcW w:w="0" w:type="auto"/>
-          </w:tcPr>
-          <w:p>
-            <w:pPr>
-              <w:spacing w:after="0"/>
-            </w:pPr>
-            <w:r>
-              <w:t>상단 COM 선택값을 적용합니다. Sentence 목록의 COM 선택값과 함께 사용됩니다.</w:t>
-            </w:r>
-          </w:p>
-        </w:tc>
-      </w:tr>
-      <w:tr>
-        <w:tc>
-          <w:tcPr>
-            <w:tcW w:w="0" w:type="auto"/>
+            <w:tcW w:w="8561" w:type="dxa"/>
+          </w:tcPr>
+          <w:p>
+            <w:pPr>
+              <w:spacing w:after="0"/>
+            </w:pPr>
+            <w:r>
+              <w:t>상단 COM 선택</w:t>
+            </w:r>
+            <w:r>
+              <w:rPr>
+                <w:rFonts w:hint="eastAsia"/>
+              </w:rPr>
+              <w:t xml:space="preserve"> </w:t>
+            </w:r>
+            <w:r>
+              <w:t>값을 적용합니다. Sentence 목록의 COM 선택</w:t>
+            </w:r>
+            <w:r>
+              <w:rPr>
+                <w:rFonts w:hint="eastAsia"/>
+              </w:rPr>
+              <w:t xml:space="preserve"> </w:t>
+            </w:r>
+            <w:r>
+              <w:t>값</w:t>
+            </w:r>
+            <w:r>
+              <w:rPr>
+                <w:rFonts w:hint="eastAsia"/>
+              </w:rPr>
+              <w:t>을 한</w:t>
+            </w:r>
+            <w:r>
+              <w:rPr>
+                <w:rFonts w:hint="eastAsia"/>
+              </w:rPr>
+              <w:t xml:space="preserve"> </w:t>
+            </w:r>
+            <w:r>
+              <w:rPr>
+                <w:rFonts w:hint="eastAsia"/>
+              </w:rPr>
+              <w:t>번에 제어합니다.</w:t>
+            </w:r>
+          </w:p>
+        </w:tc>
+      </w:tr>
+      <w:tr>
+        <w:tc>
+          <w:tcPr>
+            <w:tcW w:w="1985" w:type="dxa"/>
           </w:tcPr>
           <w:p>
             <w:pPr>
@@ -457,22 +497,30 @@
         </w:tc>
         <w:tc>
           <w:tcPr>
-            <w:tcW w:w="0" w:type="auto"/>
-          </w:tcPr>
-          <w:p>
-            <w:pPr>
-              <w:spacing w:after="0"/>
-            </w:pPr>
-            <w:r>
-              <w:t>IOS 또는 Shared Memory 기반 데이터를 사용합니다. 데이터 공급원이 없으면 Log에 SharedMemory Read Fail 메시지가 표시됩니다.</w:t>
-            </w:r>
-          </w:p>
-        </w:tc>
-      </w:tr>
-      <w:tr>
-        <w:tc>
-          <w:tcPr>
-            <w:tcW w:w="0" w:type="auto"/>
+            <w:tcW w:w="8561" w:type="dxa"/>
+          </w:tcPr>
+          <w:p>
+            <w:pPr>
+              <w:spacing w:after="0"/>
+            </w:pPr>
+            <w:r>
+              <w:t xml:space="preserve">IOS 또는 Shared Memory 기반 데이터를 사용합니다. 데이터 공급원이 없으면 Log에 </w:t>
+            </w:r>
+            <w:proofErr w:type="spellStart"/>
+            <w:r>
+              <w:t>SharedMemory</w:t>
+            </w:r>
+            <w:proofErr w:type="spellEnd"/>
+            <w:r>
+              <w:t xml:space="preserve"> Read Fail 메시지가 표시됩니다.</w:t>
+            </w:r>
+          </w:p>
+        </w:tc>
+      </w:tr>
+      <w:tr>
+        <w:tc>
+          <w:tcPr>
+            <w:tcW w:w="1985" w:type="dxa"/>
           </w:tcPr>
           <w:p>
             <w:pPr>
@@ -485,7 +533,7 @@
         </w:tc>
         <w:tc>
           <w:tcPr>
-            <w:tcW w:w="0" w:type="auto"/>
+            <w:tcW w:w="8561" w:type="dxa"/>
           </w:tcPr>
           <w:p>
             <w:pPr>
@@ -500,7 +548,7 @@
       <w:tr>
         <w:tc>
           <w:tcPr>
-            <w:tcW w:w="0" w:type="auto"/>
+            <w:tcW w:w="1985" w:type="dxa"/>
           </w:tcPr>
           <w:p>
             <w:pPr>
@@ -513,22 +561,30 @@
         </w:tc>
         <w:tc>
           <w:tcPr>
-            <w:tcW w:w="0" w:type="auto"/>
-          </w:tcPr>
-          <w:p>
-            <w:pPr>
-              <w:spacing w:after="0"/>
-            </w:pPr>
-            <w:r>
-              <w:t>COM BaudRate, UDP 송신 방식, Sentence별 UDP Endpoint 설정 창을 엽니다.</w:t>
-            </w:r>
-          </w:p>
-        </w:tc>
-      </w:tr>
-      <w:tr>
-        <w:tc>
-          <w:tcPr>
-            <w:tcW w:w="0" w:type="auto"/>
+            <w:tcW w:w="8561" w:type="dxa"/>
+          </w:tcPr>
+          <w:p>
+            <w:pPr>
+              <w:spacing w:after="0"/>
+            </w:pPr>
+            <w:r>
+              <w:t xml:space="preserve">COM </w:t>
+            </w:r>
+            <w:proofErr w:type="spellStart"/>
+            <w:r>
+              <w:t>BaudRate</w:t>
+            </w:r>
+            <w:proofErr w:type="spellEnd"/>
+            <w:r>
+              <w:t>, UDP 송신 방식, Sentence별 UDP Endpoint 설정 창을 엽니다.</w:t>
+            </w:r>
+          </w:p>
+        </w:tc>
+      </w:tr>
+      <w:tr>
+        <w:tc>
+          <w:tcPr>
+            <w:tcW w:w="1985" w:type="dxa"/>
           </w:tcPr>
           <w:p>
             <w:pPr>
@@ -541,7 +597,7 @@
         </w:tc>
         <w:tc>
           <w:tcPr>
-            <w:tcW w:w="0" w:type="auto"/>
+            <w:tcW w:w="8561" w:type="dxa"/>
           </w:tcPr>
           <w:p>
             <w:pPr>
@@ -580,7 +636,16 @@
         <w:spacing w:after="80"/>
       </w:pPr>
       <w:r>
-        <w:t>2. 필요 시 APPLY 버튼을 눌러 선택한 COM 설정을 반영합니다.</w:t>
+        <w:t>2. 필요 시 APPLY 버튼을 눌러 선택한 COM 설정을</w:t>
+      </w:r>
+      <w:r>
+        <w:rPr>
+          <w:rFonts w:hint="eastAsia"/>
+        </w:rPr>
+        <w:t xml:space="preserve"> 전체</w:t>
+      </w:r>
+      <w:r>
+        <w:t xml:space="preserve"> 반영합니다.</w:t>
       </w:r>
     </w:p>
     <w:p>
@@ -604,7 +669,16 @@
         <w:spacing w:after="80"/>
       </w:pPr>
       <w:r>
-        <w:t>5. COM 송신이 필요한 Sentence는 COM 체크 및 COM 포트 선택값을 확인합니다.</w:t>
+        <w:t>5. COM 송신이 필요한 Sentence는 COM 체크 및 COM 포트 선택</w:t>
+      </w:r>
+      <w:r>
+        <w:rPr>
+          <w:rFonts w:hint="eastAsia"/>
+        </w:rPr>
+        <w:t xml:space="preserve"> </w:t>
+      </w:r>
+      <w:r>
+        <w:t>값을 확인합니다.</w:t>
       </w:r>
     </w:p>
     <w:p>
@@ -967,7 +1041,10 @@
               <w:spacing w:after="0"/>
             </w:pPr>
             <w:r>
-              <w:t>행 상세 정보를 펼치거나 접습니다.</w:t>
+              <w:rPr>
+                <w:rFonts w:hint="eastAsia"/>
+              </w:rPr>
+              <w:t>해당 Sentence를 추가하거나 삭제합니다.</w:t>
             </w:r>
           </w:p>
         </w:tc>
@@ -1231,7 +1308,15 @@
         <w:spacing w:after="180"/>
       </w:pPr>
       <w:r>
-        <w:t>그림 2. Settings 화면 - COM BaudRate 및 UDP Transport 설정</w:t>
+        <w:t xml:space="preserve">그림 2. Settings 화면 - COM </w:t>
+      </w:r>
+      <w:proofErr w:type="spellStart"/>
+      <w:r>
+        <w:t>BaudRate</w:t>
+      </w:r>
+      <w:proofErr w:type="spellEnd"/>
+      <w:r>
+        <w:t xml:space="preserve"> 및 UDP Transport 설정</w:t>
       </w:r>
     </w:p>
     <w:p>
@@ -1254,15 +1339,28 @@
         <w:spacing w:after="120"/>
       </w:pPr>
       <w:r>
-        <w:t>COM Port BaudRate</w:t>
-      </w:r>
+        <w:t xml:space="preserve">COM Port </w:t>
+      </w:r>
+      <w:proofErr w:type="spellStart"/>
+      <w:r>
+        <w:t>BaudRate</w:t>
+      </w:r>
+      <w:proofErr w:type="spellEnd"/>
     </w:p>
     <w:p>
       <w:pPr>
         <w:spacing w:after="80"/>
       </w:pPr>
       <w:r>
-        <w:t>• COM3, COM4, COM7, COM8 등 프로그램에서 인식한 COM 포트별 BaudRate를 지정합니다.</w:t>
+        <w:t xml:space="preserve">• COM3, COM4, COM7, COM8 등 프로그램에서 인식한 COM 포트별 </w:t>
+      </w:r>
+      <w:proofErr w:type="spellStart"/>
+      <w:r>
+        <w:t>BaudRate</w:t>
+      </w:r>
+      <w:proofErr w:type="spellEnd"/>
+      <w:r>
+        <w:t>를 지정합니다.</w:t>
       </w:r>
     </w:p>
     <w:p>
@@ -1656,8 +1754,13 @@
             <w:pPr>
               <w:spacing w:after="0"/>
             </w:pPr>
-            <w:r>
-              <w:t>SharedMemory Read Fail: STR_OWNSHIP_DATA shared memory was not found.</w:t>
+            <w:proofErr w:type="spellStart"/>
+            <w:r>
+              <w:t>SharedMemory</w:t>
+            </w:r>
+            <w:proofErr w:type="spellEnd"/>
+            <w:r>
+              <w:t xml:space="preserve"> Read Fail: STR_OWNSHIP_DATA shared memory was not found.</w:t>
             </w:r>
           </w:p>
         </w:tc>
@@ -1815,7 +1918,15 @@
               <w:spacing w:after="0"/>
             </w:pPr>
             <w:r>
-              <w:t>COM 포트 선택, BaudRate, 케이블 연결, 대상 장비 수신 속도, 다른 프로그램의 포트 점유 여부를 확인합니다.</w:t>
+              <w:t xml:space="preserve">COM 포트 선택, </w:t>
+            </w:r>
+            <w:proofErr w:type="spellStart"/>
+            <w:r>
+              <w:t>BaudRate</w:t>
+            </w:r>
+            <w:proofErr w:type="spellEnd"/>
+            <w:r>
+              <w:t>, 케이블 연결, 대상 장비 수신 속도, 다른 프로그램의 포트 점유 여부를 확인합니다.</w:t>
             </w:r>
           </w:p>
         </w:tc>
@@ -1871,7 +1982,16 @@
               <w:spacing w:after="0"/>
             </w:pPr>
             <w:r>
-              <w:t>Source 모드와 Manual Data 입력값, IOS/Shared Memory 공급 상태를 확인합니다.</w:t>
+              <w:t>Source 모드와 Manual Data 입력</w:t>
+            </w:r>
+            <w:r>
+              <w:rPr>
+                <w:rFonts w:hint="eastAsia"/>
+              </w:rPr>
+              <w:t xml:space="preserve"> </w:t>
+            </w:r>
+            <w:r>
+              <w:t>값, IOS/Shared Memory 공급 상태를 확인합니다.</w:t>
             </w:r>
           </w:p>
         </w:tc>
@@ -1899,7 +2019,16 @@
               <w:spacing w:after="0"/>
             </w:pPr>
             <w:r>
-              <w:t>Settings 화면에서 Save를 눌렀는지 확인하고, 필요 시 프로그램을 재시작합니다.</w:t>
+              <w:t xml:space="preserve">Settings 화면에서 Save를 눌렀는지 확인하고, 필요 시 프로그램을 </w:t>
+            </w:r>
+            <w:r>
+              <w:rPr>
+                <w:rFonts w:hint="eastAsia"/>
+              </w:rPr>
+              <w:t>재시작 합니다</w:t>
+            </w:r>
+            <w:r>
+              <w:t>.</w:t>
             </w:r>
           </w:p>
         </w:tc>
@@ -1923,7 +2052,15 @@
         <w:spacing w:after="80"/>
       </w:pPr>
       <w:r>
-        <w:t>• 프로그램 시작 전 COM BaudRate와 UDP Port를 먼저 확인합니다.</w:t>
+        <w:t xml:space="preserve">• 프로그램 시작 전 COM </w:t>
+      </w:r>
+      <w:proofErr w:type="spellStart"/>
+      <w:r>
+        <w:t>BaudRate</w:t>
+      </w:r>
+      <w:proofErr w:type="spellEnd"/>
+      <w:r>
+        <w:t>와 UDP Port를 먼저 확인합니다.</w:t>
       </w:r>
     </w:p>
     <w:p>
@@ -2058,6 +2195,9 @@
       <w:jc w:val="right"/>
     </w:pPr>
     <w:r>
+      <w:rPr>
+        <w:noProof/>
+      </w:rPr>
       <w:drawing>
         <wp:inline distT="0" distB="0" distL="0" distR="0" wp14:anchorId="55D3B376" wp14:editId="35989E2B">
           <wp:extent cx="771525" cy="304800"/>
@@ -2159,11 +2299,11 @@
       <w:pBdr>
         <w:bottom w:val="single" w:sz="6" w:space="1" w:color="auto"/>
       </w:pBdr>
-      <w:rPr>
-        <w:rFonts w:hint="eastAsia"/>
-      </w:rPr>
     </w:pPr>
     <w:r>
+      <w:rPr>
+        <w:noProof/>
+      </w:rPr>
       <w:drawing>
         <wp:inline distT="0" distB="0" distL="0" distR="0" wp14:anchorId="5FF91A34" wp14:editId="562D3DED">
           <wp:extent cx="771525" cy="304800"/>
@@ -2248,11 +2388,11 @@
       <w:pBdr>
         <w:bottom w:val="single" w:sz="6" w:space="1" w:color="auto"/>
       </w:pBdr>
-      <w:rPr>
-        <w:rFonts w:hint="eastAsia"/>
-      </w:rPr>
     </w:pPr>
     <w:r>
+      <w:rPr>
+        <w:noProof/>
+      </w:rPr>
       <w:drawing>
         <wp:inline distT="0" distB="0" distL="0" distR="0" wp14:anchorId="7D75352F" wp14:editId="14864BD4">
           <wp:extent cx="771525" cy="304800"/>
@@ -2751,6 +2891,7 @@
   <w:style w:type="character" w:default="1" w:styleId="a0">
     <w:name w:val="Default Paragraph Font"/>
     <w:uiPriority w:val="1"/>
+    <w:semiHidden/>
     <w:unhideWhenUsed/>
   </w:style>
   <w:style w:type="table" w:default="1" w:styleId="a1">

</xml_diff>